<commit_message>
Strip revision narration from Draft_016 and Excel; corrections only
</commit_message>
<xml_diff>
--- a/thesis/003_ThesisProposal_Draft_016.docx
+++ b/thesis/003_ThesisProposal_Draft_016.docx
@@ -2737,7 +2737,7 @@
           <w:szCs w:val="22"/>
           <w:rtl w:val="0"/>
         </w:rPr>
-        <w:t xml:space="preserve">Following an initial coding pass, borderline tokens were re-examined using the contextual decision rules in Appendix A. Particular attention was given to potentially ambiguous forms such as can, potential, indicating, and possibility, because these forms may function either as epistemic hedges or as non-epistemic lexical items depending on context. Four rule refinements were applied during this revision pass. First, “can” combined with an active content verb describing a treatment effect (enhance, promote, reduce, help) was classified as capability (FP-Cap) regardless of whether it appeared inside a “suggests that” clause, because the Working Test showed that removing “can” alone did not change the epistemic weight of the clause when “suggests” was already carrying the hedge. Second, the “indicating” tautology test was extended beyond numeric restatement to cover field-standard interpretive thresholds: “non-toxic” from no mortality observed, “limited benefits” from poor performance, and “superior feed efficiency” from lower feed conversion ratio were all reclassified as operational restatements (FP-Gen) rather than inferential hedges. Third, the “potential + noun” topic-naming rule was extended to “possibility + noun” in aim and methods sentences. For “potential + noun” constructions, structural position is the primary disambiguator: aim, methods, and pure topic-naming frames are coded FP-Gen; results and conclusion frames that qualify a finding-claim are coded Lexical EC. The Working Test is applied as a secondary check. In Draft_016, five borderline rationale-position tokens that pass the Working Test (removing “potential” changes commitment) were recoded from FP-Gen to Lexical EC: B11, B12, B16 (rationale “public health concerns”), VM9, and Aas5. Fourth, a multi-hedge Working Test rule was added: when a sentence contains multiple hedge-like tokens, each token is tested individually in isolation, ignoring the other hedges in the sentence; a token counts only if removing it alone changes the epistemic weight of its own clause. The final corpus therefore reflects contextual rather than purely lexical classification, and the 58 rejected candidates document the decision trail for tokens that were considered but ultimately excluded. Additionally, the outlier abstract Acs2 was found to use a repeated hedging template (“This suggests that while X might not have been Y, Z could still [verb] beneficial effects”) twice with light variation, inflating its own token count through formulaic repetition rather than independent hedging decisions.</w:t>
+        <w:t xml:space="preserve">Following an initial coding pass, borderline tokens were re-examined using the contextual decision rules in Appendix A. Particular attention was given to potentially ambiguous forms such as can, potential, indicating, and possibility, because these forms may function either as epistemic hedges or as non-epistemic lexical items depending on context. Four rule refinements were applied during this revision pass. First, “can” combined with an active content verb describing a treatment effect (enhance, promote, reduce, help) was classified as capability (FP-Cap) regardless of whether it appeared inside a “suggests that” clause, because the Working Test showed that removing “can” alone did not change the epistemic weight of the clause when “suggests” was already carrying the hedge. Second, the “indicating” tautology test was extended beyond numeric restatement to cover field-standard interpretive thresholds: “non-toxic” from no mortality observed, “limited benefits” from poor performance, and “superior feed efficiency” from lower feed conversion ratio were all reclassified as operational restatements (FP-Gen) rather than inferential hedges. Third, the “potential + noun” topic-naming rule was extended to “possibility + noun” in aim and methods sentences. For “potential + noun” constructions, structural position is the primary disambiguator: aim, methods, and pure topic-naming frames are coded FP-Gen; results and conclusion frames that qualify a finding-claim are coded Lexical EC. The Working Test is applied as a secondary check: when removing the token clearly changes commitment to a proposition, the token is coded Lexical EC even in a rationale sentence. Fourth, a multi-hedge Working Test rule was added: when a sentence contains multiple hedge-like tokens, each token is tested individually in isolation, ignoring the other hedges in the sentence; a token counts only if removing it alone changes the epistemic weight of its own clause. The final corpus therefore reflects contextual rather than purely lexical classification, and the 58 rejected candidates document the decision trail for tokens that were considered but ultimately excluded. Additionally, the outlier abstract Acs2 was found to use a repeated hedging template (“This suggests that while X might not have been Y, Z could still [verb] beneficial effects”) twice with light variation, inflating its own token count through formulaic repetition rather than independent hedging decisions.</w:t>
       </w:r>
       <w:r>
         <w:rPr>
@@ -6106,7 +6106,7 @@
           <w:szCs w:val="22"/>
           <w:rtl w:val="0"/>
         </w:rPr>
-        <w:t xml:space="preserve">The corpus also yielded 58 false positive tokens, hedge-like words that were initially flagged but rejected after applying the codebook’s Working Test. The false positive breakdown shows FP-Gen (general exclusion, including topic-naming and evidential pointers) at 33 instances, FP-Rec (recommendations) at 15, FP-Proc (procedural norms) at 2, and FP-Cap (capability) at 8. The high number of FP-Gen instances, particularly involving the word “potential” in aim and methods statements, reflects a systematic ambiguity in the corpus: the same word functions as a hedge in conclusion sentences but as topic-naming in introduction and methods sentences. This distinction was codified in the codebook’s rule for “potential + noun” constructions, with structural position as the primary disambiguator and the Working Test as a secondary check. Five borderline rationale-position tokens that pass the Working Test were recoded as Lexical EC in Draft_016. The rule remains the most methodologically interesting feature of the coding scheme: surface-level keyword matching would have inflated the hedge count by treating topic-naming instances as epistemic hedges.</w:t>
+        <w:t xml:space="preserve">The corpus also yielded 58 false positive tokens, hedge-like words that were initially flagged but rejected after applying the codebook’s Working Test. The false positive breakdown shows FP-Gen (general exclusion, including topic-naming and evidential pointers) at 33 instances, FP-Rec (recommendations) at 15, FP-Proc (procedural norms) at 2, and FP-Cap (capability) at 8. The high number of FP-Gen instances, particularly involving the word “potential” in aim and methods statements, reflects a systematic ambiguity in the corpus: the same word functions as a hedge in conclusion sentences but as topic-naming in introduction and methods sentences. This distinction was codified in the codebook’s rule for “potential + noun” constructions, with structural position as the primary disambiguator and the Working Test as a secondary check. The rule remains the most methodologically interesting feature of the coding scheme: surface-level keyword matching would have inflated the hedge count by treating topic-naming instances as epistemic hedges.</w:t>
       </w:r>
       <w:r>
         <w:rPr>
@@ -14151,7 +14151,7 @@
           <w:szCs w:val="22"/>
           <w:rtl w:val="0"/>
         </w:rPr>
-        <w:t xml:space="preserve">Extensions: “imply/implies/implying” functions as suggest. “Can be concluded / derived / stated / attributed to / seen as” is an inferential hedge, distinct from capability “can” (see Decision Rules). “Potentially” is an adverbial hedge. “Potential” naming the research object itself (e.g., “assessed the potential of X”) is not markable, it names a topic rather than qualifying a claim. Rule for “potential + noun” constructions: structural position is primary. If the phrase sits in an aim, methods, or pure topic-naming frame (naming the research object, e.g., “assessed the potential of X”), treat as topic-naming (EC). If it sits in a results or conclusion sentence qualifying a finding-claim, treat as a Lexical hedge (EC). The Working Test is applied as a secondary check: when removing the token clearly changes commitment to a proposition (e.g., “posed potential health risks” → “posed health risks”), code as Lexical EC even in a rationale sentence. Five such borderline cases were recoded in Draft_016.</w:t>
+        <w:t xml:space="preserve">Extensions: “imply/implies/implying” functions as suggest. “Can be concluded / derived / stated / attributed to / seen as” is an inferential hedge, distinct from capability “can” (see Decision Rules). “Potentially” is an adverbial hedge. “Potential” naming the research object itself (e.g., “assessed the potential of X”) is not markable, it names a topic rather than qualifying a claim. Rule for “potential + noun” constructions: structural position is primary. If the phrase sits in an aim, methods, or pure topic-naming frame (naming the research object, e.g., “assessed the potential of X”), treat as topic-naming (EC). If it sits in a results or conclusion sentence qualifying a finding-claim, treat as a Lexical hedge (EC). The Working Test is applied as a secondary check: when removing the token clearly changes commitment to a proposition (e.g., “posed potential health risks” → “posed health risks”), code as Lexical EC even in a rationale sentence.</w:t>
       </w:r>
       <w:r>
         <w:rPr>

</xml_diff>

<commit_message>
Strip all revision narration from Draft_016 and Excel; present-tense decision rules only
</commit_message>
<xml_diff>
--- a/thesis/003_ThesisProposal_Draft_016.docx
+++ b/thesis/003_ThesisProposal_Draft_016.docx
@@ -2711,7 +2711,7 @@
           <w:szCs w:val="24"/>
           <w:rtl w:val="0"/>
         </w:rPr>
-        <w:t xml:space="preserve">CODING REVISIONS AND BORDERLINE CASES</w:t>
+        <w:t xml:space="preserve">CODING DECISION RULES FOR AMBIGUOUS CASES</w:t>
       </w:r>
       <w:r>
         <w:rPr>
@@ -2737,7 +2737,7 @@
           <w:szCs w:val="22"/>
           <w:rtl w:val="0"/>
         </w:rPr>
-        <w:t xml:space="preserve">Following an initial coding pass, borderline tokens were re-examined using the contextual decision rules in Appendix A. Particular attention was given to potentially ambiguous forms such as can, potential, indicating, and possibility, because these forms may function either as epistemic hedges or as non-epistemic lexical items depending on context. Four rule refinements were applied during this revision pass. First, “can” combined with an active content verb describing a treatment effect (enhance, promote, reduce, help) was classified as capability (FP-Cap) regardless of whether it appeared inside a “suggests that” clause, because the Working Test showed that removing “can” alone did not change the epistemic weight of the clause when “suggests” was already carrying the hedge. Second, the “indicating” tautology test was extended beyond numeric restatement to cover field-standard interpretive thresholds: “non-toxic” from no mortality observed, “limited benefits” from poor performance, and “superior feed efficiency” from lower feed conversion ratio were all reclassified as operational restatements (FP-Gen) rather than inferential hedges. Third, the “potential + noun” topic-naming rule was extended to “possibility + noun” in aim and methods sentences. For “potential + noun” constructions, structural position is the primary disambiguator: aim, methods, and pure topic-naming frames are coded FP-Gen; results and conclusion frames that qualify a finding-claim are coded Lexical EC. The Working Test is applied as a secondary check: when removing the token clearly changes commitment to a proposition, the token is coded Lexical EC even in a rationale sentence. Fourth, a multi-hedge Working Test rule was added: when a sentence contains multiple hedge-like tokens, each token is tested individually in isolation, ignoring the other hedges in the sentence; a token counts only if removing it alone changes the epistemic weight of its own clause. The final corpus therefore reflects contextual rather than purely lexical classification, and the 58 rejected candidates document the decision trail for tokens that were considered but ultimately excluded. Additionally, the outlier abstract Acs2 was found to use a repeated hedging template (“This suggests that while X might not have been Y, Z could still [verb] beneficial effects”) twice with light variation, inflating its own token count through formulaic repetition rather than independent hedging decisions.</w:t>
+        <w:t xml:space="preserve">Ambiguous forms such as can, potential, indicating, and possibility may function either as epistemic hedges or as non-epistemic lexical items depending on context. The following decision rules govern these cases. First, “can” combined with an active content verb describing a treatment effect (enhance, promote, reduce, help) is classified as capability (FP-Cap) regardless of whether it appears inside a “suggests that” clause, because the Working Test shows that removing “can” alone does not change the epistemic weight of the clause when “suggests” is already carrying the hedge. Second, the “indicating” tautology test covers not only numeric restatement but also field-standard interpretive thresholds: “non-toxic” from no mortality observed, “limited benefits” from poor performance, and “superior feed efficiency” from lower feed conversion ratio are treated as operational restatements (FP-Gen) rather than inferential hedges. Third, for “potential + noun” constructions, structural position is the primary disambiguator: aim, methods, and pure topic-naming frames are coded FP-Gen; results and conclusion frames that qualify a finding-claim are coded Lexical EC. The Working Test is applied as a secondary check: when removing the token clearly changes commitment to a proposition, the token is coded Lexical EC even in a rationale sentence. The same position-based treatment applies to “possibility + noun” in aim and methods sentences. Fourth, when a sentence contains multiple hedge-like tokens, each token is tested individually in isolation, ignoring the other hedges in the sentence; a token counts only if removing it alone changes the epistemic weight of its own clause. The corpus therefore reflects contextual rather than purely lexical classification, and the 58 rejected candidates document the decision trail for tokens that were considered but excluded. Additionally, the outlier abstract Acs2 uses a repeated hedging template (“This suggests that while X might not have been Y, Z could still [verb] beneficial effects”) twice with light variation, inflating its own token count through formulaic repetition rather than independent hedging decisions.</w:t>
       </w:r>
       <w:r>
         <w:rPr>
@@ -6106,7 +6106,7 @@
           <w:szCs w:val="22"/>
           <w:rtl w:val="0"/>
         </w:rPr>
-        <w:t xml:space="preserve">The corpus also yielded 58 false positive tokens, hedge-like words that were initially flagged but rejected after applying the codebook’s Working Test. The false positive breakdown shows FP-Gen (general exclusion, including topic-naming and evidential pointers) at 33 instances, FP-Rec (recommendations) at 15, FP-Proc (procedural norms) at 2, and FP-Cap (capability) at 8. The high number of FP-Gen instances, particularly involving the word “potential” in aim and methods statements, reflects a systematic ambiguity in the corpus: the same word functions as a hedge in conclusion sentences but as topic-naming in introduction and methods sentences. This distinction was codified in the codebook’s rule for “potential + noun” constructions, with structural position as the primary disambiguator and the Working Test as a secondary check. The rule remains the most methodologically interesting feature of the coding scheme: surface-level keyword matching would have inflated the hedge count by treating topic-naming instances as epistemic hedges.</w:t>
+        <w:t xml:space="preserve">The corpus also yielded 58 false positive tokens, hedge-like words that were rejected after applying the codebook’s Working Test. The false positive breakdown shows FP-Gen (general exclusion, including topic-naming and evidential pointers) at 33 instances, FP-Rec (recommendations) at 15, FP-Proc (procedural norms) at 2, and FP-Cap (capability) at 8. The high number of FP-Gen instances, particularly involving the word “potential” in aim and methods statements, reflects a systematic ambiguity in the corpus: the same word functions as a hedge in conclusion sentences but as topic-naming in introduction and methods sentences. This distinction was codified in the codebook’s rule for “potential + noun” constructions, with structural position as the primary disambiguator and the Working Test as a secondary check. The rule remains the most methodologically interesting feature of the coding scheme: surface-level keyword matching would have inflated the hedge count by treating topic-naming instances as epistemic hedges.</w:t>
       </w:r>
       <w:r>
         <w:rPr>

</xml_diff>